<commit_message>
added content and need started to seperate basics and optmization of a motor
</commit_message>
<xml_diff>
--- a/_includes/blog/notes/motor/output/motor.docx
+++ b/_includes/blog/notes/motor/output/motor.docx
@@ -7,7 +7,7 @@
         <w:pStyle w:val="Title"/>
       </w:pPr>
       <w:r>
-        <w:t xml:space="preserve">Study</w:t>
+        <w:t xml:space="preserve">Basics</w:t>
       </w:r>
       <w:r>
         <w:t xml:space="preserve"> </w:t>
@@ -19,31 +19,13 @@
         <w:t xml:space="preserve"> </w:t>
       </w:r>
       <w:r>
-        <w:t xml:space="preserve">PMSM/BLDC</w:t>
-      </w:r>
-      <w:r>
-        <w:t xml:space="preserve"> </w:t>
-      </w:r>
-      <w:r>
-        <w:t xml:space="preserve">Motor:</w:t>
-      </w:r>
-      <w:r>
-        <w:t xml:space="preserve"> </w:t>
-      </w:r>
-      <w:r>
-        <w:t xml:space="preserve">Design,</w:t>
-      </w:r>
-      <w:r>
-        <w:t xml:space="preserve"> </w:t>
-      </w:r>
-      <w:r>
-        <w:t xml:space="preserve">Dynamics,</w:t>
-      </w:r>
-      <w:r>
-        <w:t xml:space="preserve"> </w:t>
-      </w:r>
-      <w:r>
-        <w:t xml:space="preserve">Drive</w:t>
+        <w:t xml:space="preserve">a</w:t>
+      </w:r>
+      <w:r>
+        <w:t xml:space="preserve"> </w:t>
+      </w:r>
+      <w:r>
+        <w:t xml:space="preserve">Motor</w:t>
       </w:r>
     </w:p>
     <w:p>
@@ -72,80 +54,84 @@
       <w:pPr>
         <w:pStyle w:val="Heading3"/>
       </w:pPr>
-      <w:bookmarkStart w:id="20" w:name="introduction"/>
-      <w:r>
-        <w:t xml:space="preserve">Introduction</w:t>
+      <w:bookmarkStart w:id="20" w:name="content"/>
+      <w:r>
+        <w:t xml:space="preserve">Content</w:t>
       </w:r>
       <w:bookmarkEnd w:id="20"/>
     </w:p>
     <w:p>
       <w:pPr>
+        <w:pStyle w:val="Compact"/>
+        <w:numPr>
+          <w:numId w:val="1001"/>
+          <w:ilvl w:val="0"/>
+        </w:numPr>
+      </w:pPr>
+      <w:hyperlink w:anchor="basic-terminology">
+        <w:r>
+          <w:rPr>
+            <w:rStyle w:val="Hyperlink"/>
+          </w:rPr>
+          <w:t xml:space="preserve">Basic Terminology</w:t>
+        </w:r>
+      </w:hyperlink>
+    </w:p>
+    <w:p>
+      <w:pPr>
+        <w:pStyle w:val="Compact"/>
+        <w:numPr>
+          <w:numId w:val="1001"/>
+          <w:ilvl w:val="0"/>
+        </w:numPr>
+      </w:pPr>
+      <w:hyperlink w:anchor="motor-parameters">
+        <w:r>
+          <w:rPr>
+            <w:rStyle w:val="Hyperlink"/>
+          </w:rPr>
+          <w:t xml:space="preserve">Motor Parameters</w:t>
+        </w:r>
+      </w:hyperlink>
+    </w:p>
+    <w:p>
+      <w:pPr>
+        <w:pStyle w:val="Compact"/>
+        <w:numPr>
+          <w:numId w:val="1001"/>
+          <w:ilvl w:val="0"/>
+        </w:numPr>
+      </w:pPr>
+      <w:hyperlink w:anchor="characteristics">
+        <w:r>
+          <w:rPr>
+            <w:rStyle w:val="Hyperlink"/>
+          </w:rPr>
+          <w:t xml:space="preserve">Characteristics</w:t>
+        </w:r>
+      </w:hyperlink>
+    </w:p>
+    <w:p>
+      <w:pPr>
+        <w:pStyle w:val="Compact"/>
+        <w:numPr>
+          <w:numId w:val="1001"/>
+          <w:ilvl w:val="0"/>
+        </w:numPr>
+      </w:pPr>
+      <w:hyperlink w:anchor="losses">
+        <w:r>
+          <w:rPr>
+            <w:rStyle w:val="Hyperlink"/>
+          </w:rPr>
+          <w:t xml:space="preserve">Losses</w:t>
+        </w:r>
+      </w:hyperlink>
+    </w:p>
+    <w:p>
+      <w:pPr>
         <w:pStyle w:val="FirstParagraph"/>
       </w:pPr>
-      <w:r>
-        <w:t xml:space="preserve">What is a robot?</w:t>
-      </w:r>
-    </w:p>
-    <w:p>
-      <w:pPr>
-        <w:pStyle w:val="Compact"/>
-      </w:pPr>
-      <w:r>
-        <w:t xml:space="preserve">A robot is a bunch of actuator connected by a link(a structure). Actuators, being one of the fundamental element of a robot, will determine the core capabilities and limitation of a robot.</w:t>
-      </w:r>
-      <w:r>
-        <w:t xml:space="preserve"> </w:t>
-      </w:r>
-      <w:r>
-        <w:t xml:space="preserve">Thus a thorough understanding of the actuator will help us to optimise it based upon our requirment.</w:t>
-      </w:r>
-      <w:r>
-        <w:t xml:space="preserve"> </w:t>
-      </w:r>
-      <w:r>
-        <w:t xml:space="preserve">In this article we restrict ourself to Electromagnetic Actuator (Motors), since it is the most widely used one and has a higher energy efficiency compared to others like hydraulic, pneumatic, etc. Out of all the various type of motor like Induction, Reluctance, PMSM/BLDC, DC, Stepper, etc.</w:t>
-      </w:r>
-      <w:r>
-        <w:t xml:space="preserve"> </w:t>
-      </w:r>
-      <w:r>
-        <w:t xml:space="preserve">I’ll be focusing on only BLDC/PMSM Motors due to its superior perfomance compared to others.</w:t>
-      </w:r>
-      <w:r>
-        <w:t xml:space="preserve"> </w:t>
-      </w:r>
-      <w:r>
-        <w:t xml:space="preserve">However most of the concepts you learn here, will be helpful for understanding other motors too.</w:t>
-      </w:r>
-      <w:r>
-        <w:t xml:space="preserve"> </w:t>
-      </w:r>
-      <w:r>
-        <w:t xml:space="preserve">Our goal is to understand various factors of EM actuator which influences the perfomance and hopefully to justify why</w:t>
-      </w:r>
-      <w:r>
-        <w:t xml:space="preserve"> </w:t>
-      </w:r>
-      <w:r>
-        <w:rPr>
-          <w:b/>
-        </w:rPr>
-        <w:t xml:space="preserve">pancake shaped, Quasi Direct-Drive PMSM/BLDC motor, with 4Q control drivers &amp; SEA</w:t>
-      </w:r>
-      <w:r>
-        <w:t xml:space="preserve"> </w:t>
-      </w:r>
-      <w:r>
-        <w:t xml:space="preserve">will be the norm of the robotics in future.</w:t>
-      </w:r>
-    </w:p>
-    <w:p>
-      <w:pPr>
-        <w:pStyle w:val="BodyText"/>
-      </w:pPr>
-      <w:r>
-        <w:t xml:space="preserve"> </w:t>
-      </w:r>
     </w:p>
     <w:p>
       <w:pPr>
@@ -160,7 +146,7 @@
     <w:p>
       <w:pPr>
         <w:numPr>
-          <w:numId w:val="1001"/>
+          <w:numId w:val="1002"/>
           <w:ilvl w:val="0"/>
         </w:numPr>
       </w:pPr>
@@ -262,7 +248,7 @@
     <w:p>
       <w:pPr>
         <w:numPr>
-          <w:numId w:val="1001"/>
+          <w:numId w:val="1002"/>
           <w:ilvl w:val="0"/>
         </w:numPr>
       </w:pPr>
@@ -454,7 +440,7 @@
     <w:p>
       <w:pPr>
         <w:numPr>
-          <w:numId w:val="1001"/>
+          <w:numId w:val="1002"/>
           <w:ilvl w:val="0"/>
         </w:numPr>
       </w:pPr>
@@ -567,7 +553,7 @@
     <w:p>
       <w:pPr>
         <w:numPr>
-          <w:numId w:val="1001"/>
+          <w:numId w:val="1002"/>
           <w:ilvl w:val="0"/>
         </w:numPr>
       </w:pPr>
@@ -607,7 +593,7 @@
     <w:p>
       <w:pPr>
         <w:numPr>
-          <w:numId w:val="1001"/>
+          <w:numId w:val="1002"/>
           <w:ilvl w:val="0"/>
         </w:numPr>
       </w:pPr>
@@ -632,7 +618,7 @@
     <w:p>
       <w:pPr>
         <w:numPr>
-          <w:numId w:val="1001"/>
+          <w:numId w:val="1002"/>
           <w:ilvl w:val="0"/>
         </w:numPr>
       </w:pPr>
@@ -683,7 +669,7 @@
     <w:p>
       <w:pPr>
         <w:numPr>
-          <w:numId w:val="1001"/>
+          <w:numId w:val="1002"/>
           <w:ilvl w:val="0"/>
         </w:numPr>
       </w:pPr>
@@ -748,7 +734,7 @@
     <w:p>
       <w:pPr>
         <w:numPr>
-          <w:numId w:val="1001"/>
+          <w:numId w:val="1002"/>
           <w:ilvl w:val="0"/>
         </w:numPr>
       </w:pPr>
@@ -1385,7 +1371,7 @@
     <w:p>
       <w:pPr>
         <w:numPr>
-          <w:numId w:val="1002"/>
+          <w:numId w:val="1003"/>
           <w:ilvl w:val="0"/>
         </w:numPr>
       </w:pPr>
@@ -3159,42 +3145,42 @@
       <w:pPr>
         <w:pStyle w:val="Compact"/>
         <w:numPr>
+          <w:numId w:val="1004"/>
+          <w:ilvl w:val="1"/>
+        </w:numPr>
+      </w:pPr>
+      <w:r>
+        <w:t xml:space="preserve">Increase switching rate of current.</w:t>
+      </w:r>
+    </w:p>
+    <w:p>
+      <w:pPr>
+        <w:pStyle w:val="Compact"/>
+        <w:numPr>
+          <w:numId w:val="1004"/>
+          <w:ilvl w:val="1"/>
+        </w:numPr>
+      </w:pPr>
+      <w:r>
+        <w:t xml:space="preserve">Make the current to be smooth.</w:t>
+      </w:r>
+    </w:p>
+    <w:p>
+      <w:pPr>
+        <w:pStyle w:val="Compact"/>
+        <w:numPr>
+          <w:numId w:val="1004"/>
+          <w:ilvl w:val="1"/>
+        </w:numPr>
+      </w:pPr>
+      <w:r>
+        <w:t xml:space="preserve">Increase the number of poles.</w:t>
+      </w:r>
+    </w:p>
+    <w:p>
+      <w:pPr>
+        <w:numPr>
           <w:numId w:val="1003"/>
-          <w:ilvl w:val="1"/>
-        </w:numPr>
-      </w:pPr>
-      <w:r>
-        <w:t xml:space="preserve">Increase switching rate of current.</w:t>
-      </w:r>
-    </w:p>
-    <w:p>
-      <w:pPr>
-        <w:pStyle w:val="Compact"/>
-        <w:numPr>
-          <w:numId w:val="1003"/>
-          <w:ilvl w:val="1"/>
-        </w:numPr>
-      </w:pPr>
-      <w:r>
-        <w:t xml:space="preserve">Make the current to be smooth.</w:t>
-      </w:r>
-    </w:p>
-    <w:p>
-      <w:pPr>
-        <w:pStyle w:val="Compact"/>
-        <w:numPr>
-          <w:numId w:val="1003"/>
-          <w:ilvl w:val="1"/>
-        </w:numPr>
-      </w:pPr>
-      <w:r>
-        <w:t xml:space="preserve">Increase the number of poles.</w:t>
-      </w:r>
-    </w:p>
-    <w:p>
-      <w:pPr>
-        <w:numPr>
-          <w:numId w:val="1002"/>
           <w:ilvl w:val="0"/>
         </w:numPr>
       </w:pPr>
@@ -4603,7 +4589,7 @@
     <w:p>
       <w:pPr>
         <w:numPr>
-          <w:numId w:val="1002"/>
+          <w:numId w:val="1003"/>
           <w:ilvl w:val="0"/>
         </w:numPr>
       </w:pPr>
@@ -4684,7 +4670,7 @@
     <w:p>
       <w:pPr>
         <w:numPr>
-          <w:numId w:val="1002"/>
+          <w:numId w:val="1003"/>
           <w:ilvl w:val="0"/>
         </w:numPr>
       </w:pPr>
@@ -4978,7 +4964,7 @@
     <w:p>
       <w:pPr>
         <w:numPr>
-          <w:numId w:val="1002"/>
+          <w:numId w:val="1003"/>
           <w:ilvl w:val="0"/>
         </w:numPr>
       </w:pPr>
@@ -5145,7 +5131,7 @@
     <w:p>
       <w:pPr>
         <w:numPr>
-          <w:numId w:val="1002"/>
+          <w:numId w:val="1003"/>
           <w:ilvl w:val="0"/>
         </w:numPr>
       </w:pPr>
@@ -5220,7 +5206,7 @@
     <w:p>
       <w:pPr>
         <w:numPr>
-          <w:numId w:val="1002"/>
+          <w:numId w:val="1003"/>
           <w:ilvl w:val="0"/>
         </w:numPr>
       </w:pPr>
@@ -5422,7 +5408,7 @@
     <w:p>
       <w:pPr>
         <w:numPr>
-          <w:numId w:val="1002"/>
+          <w:numId w:val="1003"/>
           <w:ilvl w:val="0"/>
         </w:numPr>
       </w:pPr>
@@ -5465,7 +5451,7 @@
     <w:p>
       <w:pPr>
         <w:numPr>
-          <w:numId w:val="1004"/>
+          <w:numId w:val="1005"/>
           <w:ilvl w:val="0"/>
         </w:numPr>
       </w:pPr>
@@ -5490,7 +5476,7 @@
     <w:p>
       <w:pPr>
         <w:numPr>
-          <w:numId w:val="1004"/>
+          <w:numId w:val="1005"/>
           <w:ilvl w:val="0"/>
         </w:numPr>
       </w:pPr>
@@ -5790,7 +5776,7 @@
     <w:p>
       <w:pPr>
         <w:numPr>
-          <w:numId w:val="1004"/>
+          <w:numId w:val="1005"/>
           <w:ilvl w:val="0"/>
         </w:numPr>
       </w:pPr>
@@ -5851,7 +5837,7 @@
     <w:p>
       <w:pPr>
         <w:numPr>
-          <w:numId w:val="1004"/>
+          <w:numId w:val="1005"/>
           <w:ilvl w:val="0"/>
         </w:numPr>
       </w:pPr>
@@ -7281,7 +7267,7 @@
     <w:p>
       <w:pPr>
         <w:numPr>
-          <w:numId w:val="1004"/>
+          <w:numId w:val="1005"/>
           <w:ilvl w:val="0"/>
         </w:numPr>
       </w:pPr>
@@ -7298,7 +7284,7 @@
     <w:p>
       <w:pPr>
         <w:numPr>
-          <w:numId w:val="1004"/>
+          <w:numId w:val="1005"/>
           <w:ilvl w:val="0"/>
         </w:numPr>
       </w:pPr>
@@ -7397,7 +7383,7 @@
       <w:pPr>
         <w:pStyle w:val="Compact"/>
         <w:numPr>
-          <w:numId w:val="1005"/>
+          <w:numId w:val="1006"/>
           <w:ilvl w:val="0"/>
         </w:numPr>
       </w:pPr>
@@ -7429,7 +7415,7 @@
       <w:pPr>
         <w:pStyle w:val="Compact"/>
         <w:numPr>
-          <w:numId w:val="1005"/>
+          <w:numId w:val="1006"/>
           <w:ilvl w:val="0"/>
         </w:numPr>
       </w:pPr>
@@ -7565,237 +7551,75 @@
     </w:p>
     <w:p>
       <w:pPr>
+        <w:pStyle w:val="BodyText"/>
+      </w:pPr>
+      <w:r>
+        <w:t xml:space="preserve"> </w:t>
+      </w:r>
+    </w:p>
+    <w:p>
+      <w:pPr>
         <w:pStyle w:val="Heading3"/>
       </w:pPr>
-      <w:bookmarkStart w:id="35" w:name="selection-criteria"/>
-      <w:r>
-        <w:t xml:space="preserve">Selection Criteria</w:t>
+      <w:bookmarkStart w:id="35" w:name="to-do"/>
+      <w:r>
+        <w:t xml:space="preserve">To Do</w:t>
       </w:r>
       <w:bookmarkEnd w:id="35"/>
     </w:p>
     <w:p>
       <w:pPr>
+        <w:pStyle w:val="Compact"/>
+        <w:numPr>
+          <w:numId w:val="1007"/>
+          <w:ilvl w:val="0"/>
+        </w:numPr>
+      </w:pPr>
+      <w:r>
+        <w:t xml:space="preserve">Focus on charcteristic section</w:t>
+      </w:r>
+    </w:p>
+    <w:p>
+      <w:pPr>
+        <w:pStyle w:val="Compact"/>
+        <w:numPr>
+          <w:numId w:val="1007"/>
+          <w:ilvl w:val="0"/>
+        </w:numPr>
+      </w:pPr>
+      <w:r>
+        <w:t xml:space="preserve">Finish the core vs corless section</w:t>
+      </w:r>
+    </w:p>
+    <w:p>
+      <w:pPr>
+        <w:pStyle w:val="Compact"/>
+        <w:numPr>
+          <w:numId w:val="1007"/>
+          <w:ilvl w:val="0"/>
+        </w:numPr>
+      </w:pPr>
+      <w:r>
+        <w:t xml:space="preserve">BLDC and chaos</w:t>
+      </w:r>
+    </w:p>
+    <w:p>
+      <w:pPr>
         <w:pStyle w:val="FirstParagraph"/>
       </w:pPr>
-      <w:r>
-        <w:t xml:space="preserve">[</w:t>
-      </w:r>
-      <w:hyperlink w:anchor="ref-seok_actuator_2012">
-        <w:r>
-          <w:rPr>
-            <w:rStyle w:val="Hyperlink"/>
-          </w:rPr>
-          <w:t xml:space="preserve">2</w:t>
-        </w:r>
-      </w:hyperlink>
-      <w:r>
-        <w:t xml:space="preserve">]</w:t>
-      </w:r>
-    </w:p>
-    <w:p>
-      <w:pPr>
-        <w:pStyle w:val="BodyText"/>
-      </w:pPr>
-      <w:r>
-        <w:t xml:space="preserve">A smaller motor will have lower iron losses at a given speed (less iron to create drag), and a larger motor will have lower copper losses for a given torque.</w:t>
-      </w:r>
-    </w:p>
-    <w:p>
-      <w:pPr>
-        <w:pStyle w:val="BodyText"/>
-      </w:pPr>
-      <w:r>
-        <w:t xml:space="preserve">One interesting approach to motor sizing for a robot is to choose a small motor sized for walking, and then to overload it heavily during more strenuous activities.</w:t>
-      </w:r>
-    </w:p>
-    <w:p>
-      <w:pPr>
-        <w:pStyle w:val="BodyText"/>
-      </w:pPr>
-      <w:r>
-        <w:t xml:space="preserve">This might result in huge copper losses due to squaring the high winding current, but for brief periods the effect on overall efficiency is minimal.</w:t>
-      </w:r>
-    </w:p>
-    <w:p>
-      <w:pPr>
-        <w:pStyle w:val="BodyText"/>
-      </w:pPr>
-      <w:r>
-        <w:t xml:space="preserve">The thermal mass of the motor windings is high enough that it might not burn up for several seconds, and if it is cooled well enough the power level may be sustainable for longer activities.</w:t>
-      </w:r>
-    </w:p>
-    <w:p>
-      <w:pPr>
-        <w:pStyle w:val="BodyText"/>
-      </w:pPr>
-      <w:r>
-        <w:t xml:space="preserve">This is particularly true for permanent magnet brushless motors, in which the stator coils are stationary and in contact with the case, well-positioned for heat sinks or water cooling jackets. (For brushed motors the magnets are on the outside and the windings are in the rotor, leaving few options for cooling.</w:t>
-      </w:r>
-    </w:p>
-    <w:p>
-      <w:pPr>
-        <w:pStyle w:val="BodyText"/>
-      </w:pPr>
-      <w:r>
-        <w:t xml:space="preserve"> </w:t>
-      </w:r>
     </w:p>
     <w:p>
       <w:pPr>
         <w:pStyle w:val="Heading3"/>
       </w:pPr>
-      <w:bookmarkStart w:id="36" w:name="perfomance"/>
-      <w:r>
-        <w:t xml:space="preserve">Perfomance</w:t>
+      <w:bookmarkStart w:id="36" w:name="references"/>
+      <w:r>
+        <w:t xml:space="preserve">References</w:t>
       </w:r>
       <w:bookmarkEnd w:id="36"/>
     </w:p>
-    <w:p>
-      <w:pPr>
-        <w:pStyle w:val="FirstParagraph"/>
-      </w:pPr>
-      <w:r>
-        <w:t xml:space="preserve">Reduced noise, wear, and friction caused by brushes and Torque-Speed characteristics is linear.</w:t>
-      </w:r>
-      <w:r>
-        <w:t xml:space="preserve">[</w:t>
-      </w:r>
-      <w:hyperlink w:anchor="ref-asada_direct-drive_1987">
-        <w:r>
-          <w:rPr>
-            <w:rStyle w:val="Hyperlink"/>
-          </w:rPr>
-          <w:t xml:space="preserve">6</w:t>
-        </w:r>
-      </w:hyperlink>
-      <w:r>
-        <w:t xml:space="preserve">]</w:t>
-      </w:r>
-    </w:p>
-    <w:p>
-      <w:pPr>
-        <w:pStyle w:val="BodyText"/>
-      </w:pPr>
-      <w:r>
-        <w:t xml:space="preserve"> </w:t>
-      </w:r>
-    </w:p>
-    <w:p>
-      <w:pPr>
-        <w:pStyle w:val="Heading3"/>
-      </w:pPr>
-      <w:bookmarkStart w:id="37" w:name="to-do"/>
-      <w:r>
-        <w:t xml:space="preserve">To Do</w:t>
-      </w:r>
-      <w:bookmarkEnd w:id="37"/>
-    </w:p>
-    <w:p>
-      <w:pPr>
-        <w:pStyle w:val="Compact"/>
-        <w:numPr>
-          <w:numId w:val="1006"/>
-          <w:ilvl w:val="0"/>
-        </w:numPr>
-      </w:pPr>
-      <w:r>
-        <w:t xml:space="preserve">Finish 1.3.3 and 1.4.2 in</w:t>
-      </w:r>
-      <w:r>
-        <w:t xml:space="preserve"> </w:t>
-      </w:r>
-      <w:r>
-        <w:t xml:space="preserve">[</w:t>
-      </w:r>
-      <w:hyperlink w:anchor="ref-hendershot_design_2010">
-        <w:r>
-          <w:rPr>
-            <w:rStyle w:val="Hyperlink"/>
-          </w:rPr>
-          <w:t xml:space="preserve">8</w:t>
-        </w:r>
-      </w:hyperlink>
-      <w:r>
-        <w:t xml:space="preserve">]</w:t>
-      </w:r>
-    </w:p>
-    <w:p>
-      <w:pPr>
-        <w:pStyle w:val="Compact"/>
-        <w:numPr>
-          <w:numId w:val="1006"/>
-          <w:ilvl w:val="0"/>
-        </w:numPr>
-      </w:pPr>
-      <w:r>
-        <w:t xml:space="preserve">Maxon Document</w:t>
-      </w:r>
-    </w:p>
-    <w:p>
-      <w:pPr>
-        <w:pStyle w:val="Compact"/>
-        <w:numPr>
-          <w:numId w:val="1006"/>
-          <w:ilvl w:val="0"/>
-        </w:numPr>
-      </w:pPr>
-      <w:r>
-        <w:t xml:space="preserve">Asuting BLDC chapter</w:t>
-      </w:r>
-    </w:p>
-    <w:p>
-      <w:pPr>
-        <w:pStyle w:val="Compact"/>
-        <w:numPr>
-          <w:numId w:val="1006"/>
-          <w:ilvl w:val="0"/>
-        </w:numPr>
-      </w:pPr>
-      <w:r>
-        <w:t xml:space="preserve">Focus on charcteristic section</w:t>
-      </w:r>
-    </w:p>
-    <w:p>
-      <w:pPr>
-        <w:pStyle w:val="Compact"/>
-        <w:numPr>
-          <w:numId w:val="1006"/>
-          <w:ilvl w:val="0"/>
-        </w:numPr>
-      </w:pPr>
-      <w:r>
-        <w:t xml:space="preserve">Finish the core vs corless section</w:t>
-      </w:r>
-    </w:p>
-    <w:p>
-      <w:pPr>
-        <w:pStyle w:val="Compact"/>
-        <w:numPr>
-          <w:numId w:val="1006"/>
-          <w:ilvl w:val="0"/>
-        </w:numPr>
-      </w:pPr>
-      <w:r>
-        <w:t xml:space="preserve">BLDC and chaos</w:t>
-      </w:r>
-    </w:p>
-    <w:p>
-      <w:pPr>
-        <w:pStyle w:val="FirstParagraph"/>
-      </w:pPr>
-    </w:p>
-    <w:p>
-      <w:pPr>
-        <w:pStyle w:val="Heading3"/>
-      </w:pPr>
-      <w:bookmarkStart w:id="38" w:name="references"/>
-      <w:r>
-        <w:t xml:space="preserve">References</w:t>
-      </w:r>
-      <w:bookmarkEnd w:id="38"/>
-    </w:p>
-    <w:bookmarkStart w:id="53" w:name="refs"/>
-    <w:bookmarkStart w:id="40" w:name="ref-colton_design_2010"/>
+    <w:bookmarkStart w:id="51" w:name="refs"/>
+    <w:bookmarkStart w:id="38" w:name="ref-colton_design_2010"/>
     <w:p>
       <w:pPr>
         <w:pStyle w:val="Bibliography"/>
@@ -7806,7 +7630,7 @@
       <w:r>
         <w:t xml:space="preserve"> </w:t>
       </w:r>
-      <w:hyperlink r:id="rId39">
+      <w:hyperlink r:id="rId37">
         <w:r>
           <w:rPr>
             <w:rStyle w:val="Hyperlink"/>
@@ -7815,8 +7639,8 @@
         </w:r>
       </w:hyperlink>
     </w:p>
-    <w:bookmarkEnd w:id="40"/>
-    <w:bookmarkStart w:id="42" w:name="ref-seok_actuator_2012"/>
+    <w:bookmarkEnd w:id="38"/>
+    <w:bookmarkStart w:id="40" w:name="ref-seok_actuator_2012"/>
     <w:p>
       <w:pPr>
         <w:pStyle w:val="Bibliography"/>
@@ -7839,7 +7663,7 @@
       <w:r>
         <w:t xml:space="preserve"> </w:t>
       </w:r>
-      <w:hyperlink r:id="rId41">
+      <w:hyperlink r:id="rId39">
         <w:r>
           <w:rPr>
             <w:rStyle w:val="Hyperlink"/>
@@ -7851,8 +7675,8 @@
         <w:t xml:space="preserve">. [Accessed: 12-Sep-2018]</w:t>
       </w:r>
     </w:p>
-    <w:bookmarkEnd w:id="42"/>
-    <w:bookmarkStart w:id="43" w:name="ref-hughes_electric_2013"/>
+    <w:bookmarkEnd w:id="40"/>
+    <w:bookmarkStart w:id="41" w:name="ref-hughes_electric_2013"/>
     <w:p>
       <w:pPr>
         <w:pStyle w:val="Bibliography"/>
@@ -7876,8 +7700,8 @@
         <w:t xml:space="preserve"> </w:t>
       </w:r>
     </w:p>
-    <w:bookmarkEnd w:id="43"/>
-    <w:bookmarkStart w:id="45" w:name="ref-kenneally_leg_2015"/>
+    <w:bookmarkEnd w:id="41"/>
+    <w:bookmarkStart w:id="43" w:name="ref-kenneally_leg_2015"/>
     <w:p>
       <w:pPr>
         <w:pStyle w:val="Bibliography"/>
@@ -7900,7 +7724,7 @@
       <w:r>
         <w:t xml:space="preserve"> </w:t>
       </w:r>
-      <w:hyperlink r:id="rId44">
+      <w:hyperlink r:id="rId42">
         <w:r>
           <w:rPr>
             <w:rStyle w:val="Hyperlink"/>
@@ -7912,8 +7736,8 @@
         <w:t xml:space="preserve">. [Accessed: 27-Sep-2018]</w:t>
       </w:r>
     </w:p>
-    <w:bookmarkEnd w:id="45"/>
-    <w:bookmarkStart w:id="46" w:name="ref-wensing_proprioceptive_2017"/>
+    <w:bookmarkEnd w:id="43"/>
+    <w:bookmarkStart w:id="44" w:name="ref-wensing_proprioceptive_2017"/>
     <w:p>
       <w:pPr>
         <w:pStyle w:val="Bibliography"/>
@@ -7937,8 +7761,8 @@
         <w:t xml:space="preserve"> </w:t>
       </w:r>
     </w:p>
-    <w:bookmarkEnd w:id="46"/>
-    <w:bookmarkStart w:id="47" w:name="ref-asada_direct-drive_1987"/>
+    <w:bookmarkEnd w:id="44"/>
+    <w:bookmarkStart w:id="45" w:name="ref-asada_direct-drive_1987"/>
     <w:p>
       <w:pPr>
         <w:pStyle w:val="Bibliography"/>
@@ -7962,8 +7786,8 @@
         <w:t xml:space="preserve"> </w:t>
       </w:r>
     </w:p>
-    <w:bookmarkEnd w:id="47"/>
-    <w:bookmarkStart w:id="49" w:name="ref-kenneally_design_2016"/>
+    <w:bookmarkEnd w:id="45"/>
+    <w:bookmarkStart w:id="47" w:name="ref-kenneally_design_2016"/>
     <w:p>
       <w:pPr>
         <w:pStyle w:val="Bibliography"/>
@@ -7986,7 +7810,7 @@
       <w:r>
         <w:t xml:space="preserve"> </w:t>
       </w:r>
-      <w:hyperlink r:id="rId48">
+      <w:hyperlink r:id="rId46">
         <w:r>
           <w:rPr>
             <w:rStyle w:val="Hyperlink"/>
@@ -7998,8 +7822,8 @@
         <w:t xml:space="preserve">. [Accessed: 12-Sep-2018]</w:t>
       </w:r>
     </w:p>
-    <w:bookmarkEnd w:id="49"/>
-    <w:bookmarkStart w:id="50" w:name="ref-hendershot_design_2010"/>
+    <w:bookmarkEnd w:id="47"/>
+    <w:bookmarkStart w:id="48" w:name="ref-hendershot_design_2010"/>
     <w:p>
       <w:pPr>
         <w:pStyle w:val="Bibliography"/>
@@ -8023,8 +7847,8 @@
         <w:t xml:space="preserve"> </w:t>
       </w:r>
     </w:p>
-    <w:bookmarkEnd w:id="50"/>
-    <w:bookmarkStart w:id="51" w:name="ref-kalouche_design_2016"/>
+    <w:bookmarkEnd w:id="48"/>
+    <w:bookmarkStart w:id="49" w:name="ref-kalouche_design_2016"/>
     <w:p>
       <w:pPr>
         <w:pStyle w:val="Bibliography"/>
@@ -8036,8 +7860,8 @@
         <w:t xml:space="preserve"> </w:t>
       </w:r>
     </w:p>
-    <w:bookmarkEnd w:id="51"/>
-    <w:bookmarkStart w:id="52" w:name="ref-mason_compliance_1981"/>
+    <w:bookmarkEnd w:id="49"/>
+    <w:bookmarkStart w:id="50" w:name="ref-mason_compliance_1981"/>
     <w:p>
       <w:pPr>
         <w:pStyle w:val="Bibliography"/>
@@ -8061,8 +7885,8 @@
         <w:t xml:space="preserve"> </w:t>
       </w:r>
     </w:p>
-    <w:bookmarkEnd w:id="52"/>
-    <w:bookmarkEnd w:id="53"/>
+    <w:bookmarkEnd w:id="50"/>
+    <w:bookmarkEnd w:id="51"/>
     <w:sectPr/>
   </w:body>
 </w:document>
@@ -8299,8 +8123,111 @@
       </w:pPr>
     </w:lvl>
   </w:abstractNum>
+  <w:abstractNum w:abstractNumId="991">
+    <w:nsid w:val="ea454b4c"/>
+    <w:multiLevelType w:val="multilevel"/>
+    <w:lvl w:ilvl="0">
+      <w:numFmt w:val="bullet"/>
+      <w:lvlText w:val="•"/>
+      <w:lvlJc w:val="left"/>
+      <w:pPr>
+        <w:tabs>
+          <w:tab w:val="num" w:pos="0"/>
+        </w:tabs>
+        <w:ind w:left="480" w:hanging="480"/>
+      </w:pPr>
+    </w:lvl>
+    <w:lvl w:ilvl="1">
+      <w:numFmt w:val="bullet"/>
+      <w:lvlText w:val="–"/>
+      <w:lvlJc w:val="left"/>
+      <w:pPr>
+        <w:tabs>
+          <w:tab w:val="num" w:pos="720"/>
+        </w:tabs>
+        <w:ind w:left="1200" w:hanging="480"/>
+      </w:pPr>
+    </w:lvl>
+    <w:lvl w:ilvl="2">
+      <w:numFmt w:val="bullet"/>
+      <w:lvlText w:val="•"/>
+      <w:lvlJc w:val="left"/>
+      <w:pPr>
+        <w:tabs>
+          <w:tab w:val="num" w:pos="1440"/>
+        </w:tabs>
+        <w:ind w:left="1920" w:hanging="480"/>
+      </w:pPr>
+    </w:lvl>
+    <w:lvl w:ilvl="3">
+      <w:numFmt w:val="bullet"/>
+      <w:lvlText w:val="–"/>
+      <w:lvlJc w:val="left"/>
+      <w:pPr>
+        <w:tabs>
+          <w:tab w:val="num" w:pos="2160"/>
+        </w:tabs>
+        <w:ind w:left="2640" w:hanging="480"/>
+      </w:pPr>
+    </w:lvl>
+    <w:lvl w:ilvl="4">
+      <w:numFmt w:val="bullet"/>
+      <w:lvlText w:val="•"/>
+      <w:lvlJc w:val="left"/>
+      <w:pPr>
+        <w:tabs>
+          <w:tab w:val="num" w:pos="2880"/>
+        </w:tabs>
+        <w:ind w:left="3360" w:hanging="480"/>
+      </w:pPr>
+    </w:lvl>
+    <w:lvl w:ilvl="5">
+      <w:numFmt w:val="bullet"/>
+      <w:lvlText w:val="–"/>
+      <w:lvlJc w:val="left"/>
+      <w:pPr>
+        <w:tabs>
+          <w:tab w:val="num" w:pos="3600"/>
+        </w:tabs>
+        <w:ind w:left="4080" w:hanging="480"/>
+      </w:pPr>
+    </w:lvl>
+    <w:lvl w:ilvl="6">
+      <w:numFmt w:val="bullet"/>
+      <w:lvlText w:val="•"/>
+      <w:lvlJc w:val="left"/>
+      <w:pPr>
+        <w:tabs>
+          <w:tab w:val="num" w:pos="4320"/>
+        </w:tabs>
+        <w:ind w:left="4800" w:hanging="480"/>
+      </w:pPr>
+    </w:lvl>
+    <w:lvl w:ilvl="7">
+      <w:numFmt w:val="bullet"/>
+      <w:lvlText w:val="–"/>
+      <w:lvlJc w:val="left"/>
+      <w:pPr>
+        <w:tabs>
+          <w:tab w:val="num" w:pos="5040"/>
+        </w:tabs>
+        <w:ind w:left="5520" w:hanging="480"/>
+      </w:pPr>
+    </w:lvl>
+    <w:lvl w:ilvl="8">
+      <w:numFmt w:val="bullet"/>
+      <w:lvlText w:val="•"/>
+      <w:lvlJc w:val="left"/>
+      <w:pPr>
+        <w:tabs>
+          <w:tab w:val="num" w:pos="5760"/>
+        </w:tabs>
+        <w:ind w:left="6240" w:hanging="480"/>
+      </w:pPr>
+    </w:lvl>
+  </w:abstractNum>
   <w:abstractNum w:abstractNumId="99201">
-    <w:nsid w:val="ea454b4c"/>
+    <w:nsid w:val="71315dca"/>
     <w:multiLevelType w:val="multilevel"/>
     <w:lvl w:ilvl="0">
       <w:start w:val="1"/>
@@ -8412,7 +8339,7 @@
     </w:lvl>
   </w:abstractNum>
   <w:abstractNum w:abstractNumId="99511">
-    <w:nsid w:val="71315dca"/>
+    <w:nsid w:val="47261bad"/>
     <w:multiLevelType w:val="multilevel"/>
     <w:lvl w:ilvl="0">
       <w:start w:val="1"/>
@@ -8524,7 +8451,7 @@
     </w:lvl>
   </w:abstractNum>
   <w:abstractNum w:abstractNumId="99411">
-    <w:nsid w:val="47261bad"/>
+    <w:nsid w:val="b3cbbdee"/>
     <w:multiLevelType w:val="multilevel"/>
     <w:lvl w:ilvl="0">
       <w:start w:val="1"/>
@@ -8642,34 +8569,7 @@
     <w:abstractNumId w:val="990"/>
   </w:num>
   <w:num w:numId="1001">
-    <w:abstractNumId w:val="99201"/>
-    <w:lvlOverride w:ilvl="0">
-      <w:startOverride w:val="1"/>
-    </w:lvlOverride>
-    <w:lvlOverride w:ilvl="1">
-      <w:startOverride w:val="1"/>
-    </w:lvlOverride>
-    <w:lvlOverride w:ilvl="2">
-      <w:startOverride w:val="1"/>
-    </w:lvlOverride>
-    <w:lvlOverride w:ilvl="3">
-      <w:startOverride w:val="1"/>
-    </w:lvlOverride>
-    <w:lvlOverride w:ilvl="4">
-      <w:startOverride w:val="1"/>
-    </w:lvlOverride>
-    <w:lvlOverride w:ilvl="5">
-      <w:startOverride w:val="1"/>
-    </w:lvlOverride>
-    <w:lvlOverride w:ilvl="6">
-      <w:startOverride w:val="1"/>
-    </w:lvlOverride>
-    <w:lvlOverride w:ilvl="7">
-      <w:startOverride w:val="1"/>
-    </w:lvlOverride>
-    <w:lvlOverride w:ilvl="8">
-      <w:startOverride w:val="1"/>
-    </w:lvlOverride>
+    <w:abstractNumId w:val="991"/>
   </w:num>
   <w:num w:numId="1002">
     <w:abstractNumId w:val="99201"/>
@@ -8702,6 +8602,36 @@
     </w:lvlOverride>
   </w:num>
   <w:num w:numId="1003">
+    <w:abstractNumId w:val="99201"/>
+    <w:lvlOverride w:ilvl="0">
+      <w:startOverride w:val="1"/>
+    </w:lvlOverride>
+    <w:lvlOverride w:ilvl="1">
+      <w:startOverride w:val="1"/>
+    </w:lvlOverride>
+    <w:lvlOverride w:ilvl="2">
+      <w:startOverride w:val="1"/>
+    </w:lvlOverride>
+    <w:lvlOverride w:ilvl="3">
+      <w:startOverride w:val="1"/>
+    </w:lvlOverride>
+    <w:lvlOverride w:ilvl="4">
+      <w:startOverride w:val="1"/>
+    </w:lvlOverride>
+    <w:lvlOverride w:ilvl="5">
+      <w:startOverride w:val="1"/>
+    </w:lvlOverride>
+    <w:lvlOverride w:ilvl="6">
+      <w:startOverride w:val="1"/>
+    </w:lvlOverride>
+    <w:lvlOverride w:ilvl="7">
+      <w:startOverride w:val="1"/>
+    </w:lvlOverride>
+    <w:lvlOverride w:ilvl="8">
+      <w:startOverride w:val="1"/>
+    </w:lvlOverride>
+  </w:num>
+  <w:num w:numId="1004">
     <w:abstractNumId w:val="99511"/>
     <w:lvlOverride w:ilvl="0">
       <w:startOverride w:val="1"/>
@@ -8731,7 +8661,7 @@
       <w:startOverride w:val="1"/>
     </w:lvlOverride>
   </w:num>
-  <w:num w:numId="1004">
+  <w:num w:numId="1005">
     <w:abstractNumId w:val="99201"/>
     <w:lvlOverride w:ilvl="0">
       <w:startOverride w:val="1"/>
@@ -8761,7 +8691,7 @@
       <w:startOverride w:val="1"/>
     </w:lvlOverride>
   </w:num>
-  <w:num w:numId="1005">
+  <w:num w:numId="1006">
     <w:abstractNumId w:val="99411"/>
     <w:lvlOverride w:ilvl="0">
       <w:startOverride w:val="1"/>
@@ -8791,7 +8721,7 @@
       <w:startOverride w:val="1"/>
     </w:lvlOverride>
   </w:num>
-  <w:num w:numId="1006">
+  <w:num w:numId="1007">
     <w:abstractNumId w:val="99411"/>
     <w:lvlOverride w:ilvl="0">
       <w:startOverride w:val="1"/>

</xml_diff>

<commit_message>
what you know is hand full of sand, what you dont know is a ocean
</commit_message>
<xml_diff>
--- a/_includes/blog/notes/motor/output/motor.docx
+++ b/_includes/blog/notes/motor/output/motor.docx
@@ -219,9 +219,6 @@
         </w:numPr>
       </w:pPr>
       <w:r>
-        <w:rPr>
-          <w:b/>
-        </w:rPr>
         <w:t xml:space="preserve">Stator &amp; Rotor</w:t>
       </w:r>
     </w:p>
@@ -321,9 +318,6 @@
         </w:numPr>
       </w:pPr>
       <w:r>
-        <w:rPr>
-          <w:b/>
-        </w:rPr>
         <w:t xml:space="preserve">Air Gap</w:t>
       </w:r>
     </w:p>
@@ -346,9 +340,6 @@
         </w:numPr>
       </w:pPr>
       <w:r>
-        <w:rPr>
-          <w:b/>
-        </w:rPr>
         <w:t xml:space="preserve">Tooth &amp; Slot</w:t>
       </w:r>
     </w:p>
@@ -459,9 +450,6 @@
         </w:numPr>
       </w:pPr>
       <w:r>
-        <w:rPr>
-          <w:b/>
-        </w:rPr>
         <w:t xml:space="preserve">Phase</w:t>
       </w:r>
     </w:p>
@@ -499,9 +487,6 @@
         </w:numPr>
       </w:pPr>
       <w:r>
-        <w:rPr>
-          <w:b/>
-        </w:rPr>
         <w:t xml:space="preserve">Turns</w:t>
       </w:r>
     </w:p>
@@ -524,15 +509,9 @@
         </w:numPr>
       </w:pPr>
       <w:r>
-        <w:rPr>
-          <w:b/>
-        </w:rPr>
         <w:t xml:space="preserve">Pole</w:t>
       </w:r>
       <w:r>
-        <w:rPr>
-          <w:b/>
-        </w:rPr>
         <w:t xml:space="preserve"> </w:t>
       </w:r>
       <m:oMath>
@@ -575,10 +554,7 @@
         </w:numPr>
       </w:pPr>
       <w:r>
-        <w:rPr>
-          <w:b/>
-        </w:rPr>
-        <w:t xml:space="preserve">Field windings &amp; Armature winding ?</w:t>
+        <w:t xml:space="preserve">Field windings and Armature winding</w:t>
       </w:r>
     </w:p>
     <w:p>
@@ -640,15 +616,9 @@
         </w:numPr>
       </w:pPr>
       <w:r>
-        <w:rPr>
-          <w:b/>
-        </w:rPr>
         <w:t xml:space="preserve">Electrical Angle</w:t>
       </w:r>
       <w:r>
-        <w:rPr>
-          <w:b/>
-        </w:rPr>
         <w:t xml:space="preserve"> </w:t>
       </w:r>
       <m:oMath>
@@ -672,21 +642,12 @@
         </m:r>
       </m:oMath>
       <w:r>
-        <w:rPr>
-          <w:b/>
-        </w:rPr>
-        <w:t xml:space="preserve"> </w:t>
-      </w:r>
-      <w:r>
-        <w:rPr>
-          <w:b/>
-        </w:rPr>
-        <w:t xml:space="preserve">vs Mechanical Angle</w:t>
-      </w:r>
-      <w:r>
-        <w:rPr>
-          <w:b/>
-        </w:rPr>
+        <w:t xml:space="preserve"> </w:t>
+      </w:r>
+      <w:r>
+        <w:t xml:space="preserve">and Mechanical Angle</w:t>
+      </w:r>
+      <w:r>
         <w:t xml:space="preserve"> </w:t>
       </w:r>
       <m:oMath>
@@ -735,38 +696,7 @@
         </m:sSub>
       </m:oMath>
       <w:r>
-        <w:t xml:space="preserve">) in a motor refers to the rotation of the shaft. 1 revolution of the shaft equals 360 mechanical degrees.</w:t>
-      </w:r>
-    </w:p>
-    <w:p>
-      <w:pPr>
-        <w:numPr>
-          <w:numId w:val="1000"/>
-          <w:ilvl w:val="0"/>
-        </w:numPr>
-      </w:pPr>
-      <w:r>
-        <w:t xml:space="preserve">When an electrical machine is operating as a motor, the idea is to create a traveling, rotating magnetic field, via the stator so that this moving flux attracts the rotor.</w:t>
-      </w:r>
-    </w:p>
-    <w:p>
-      <w:pPr>
-        <w:numPr>
-          <w:numId w:val="1000"/>
-          <w:ilvl w:val="0"/>
-        </w:numPr>
-      </w:pPr>
-      <w:r>
-        <w:rPr>
-          <w:b/>
-        </w:rPr>
-        <w:t xml:space="preserve">Electrical degree</w:t>
-      </w:r>
-      <w:r>
-        <w:t xml:space="preserve"> </w:t>
-      </w:r>
-      <w:r>
-        <w:t xml:space="preserve">(</w:t>
+        <w:t xml:space="preserve">) in a motor refers to the rotation of the shaft. 1 revolution of the shaft equals 360 mechanical degrees. When an electrical machine is operating as a motor, the idea is to create a traveling, rotating magnetic field, via the stator so that this moving flux attracts the rotor. Electrical degree (</w:t>
       </w:r>
       <m:oMath>
         <m:sSub>
@@ -1287,9 +1217,6 @@
         </w:numPr>
       </w:pPr>
       <w:r>
-        <w:rPr>
-          <w:b/>
-        </w:rPr>
         <w:t xml:space="preserve">Resistance</w:t>
       </w:r>
     </w:p>
@@ -1320,9 +1247,6 @@
         </w:numPr>
       </w:pPr>
       <w:r>
-        <w:rPr>
-          <w:b/>
-        </w:rPr>
         <w:t xml:space="preserve">Inductance</w:t>
       </w:r>
     </w:p>
@@ -1560,9 +1484,6 @@
         </w:numPr>
       </w:pPr>
       <w:r>
-        <w:rPr>
-          <w:b/>
-        </w:rPr>
         <w:t xml:space="preserve">Winding Configuration</w:t>
       </w:r>
     </w:p>
@@ -1629,13 +1550,7 @@
         </w:numPr>
       </w:pPr>
       <w:r>
-        <w:rPr>
-          <w:b/>
-        </w:rPr>
-        <w:t xml:space="preserve">Gap Radius</w:t>
-      </w:r>
-      <w:r>
-        <w:t xml:space="preserve">:</w:t>
+        <w:t xml:space="preserve">Gap Radius:</w:t>
       </w:r>
     </w:p>
     <w:p>
@@ -3163,14 +3078,8 @@
         </w:numPr>
       </w:pPr>
       <w:r>
-        <w:rPr>
-          <w:b/>
-        </w:rPr>
         <w:t xml:space="preserve">Core vs Coreless</w:t>
       </w:r>
-      <w:r>
-        <w:t xml:space="preserve">:</w:t>
-      </w:r>
     </w:p>
     <w:p>
       <w:pPr>
@@ -3180,9 +3089,6 @@
         </w:numPr>
       </w:pPr>
       <w:r>
-        <w:rPr>
-          <w:b/>
-        </w:rPr>
         <w:t xml:space="preserve">Axial Flux vs Radial Flux</w:t>
       </w:r>
     </w:p>
@@ -3256,9 +3162,9 @@
       <w:pPr>
         <w:pStyle w:val="Heading3"/>
       </w:pPr>
-      <w:bookmarkStart w:id="33" w:name="characteristics"/>
-      <w:r>
-        <w:t xml:space="preserve">Characteristics</w:t>
+      <w:bookmarkStart w:id="33" w:name="characterisation"/>
+      <w:r>
+        <w:t xml:space="preserve">Characterisation</w:t>
       </w:r>
       <w:bookmarkEnd w:id="33"/>
     </w:p>
@@ -3285,15 +3191,9 @@
         </w:numPr>
       </w:pPr>
       <w:r>
-        <w:rPr>
-          <w:b/>
-        </w:rPr>
         <w:t xml:space="preserve">Torque/Back EMF constant</w:t>
       </w:r>
       <w:r>
-        <w:rPr>
-          <w:b/>
-        </w:rPr>
         <w:t xml:space="preserve"> </w:t>
       </w:r>
       <m:oMath>
@@ -5283,9 +5183,6 @@
         </w:numPr>
       </w:pPr>
       <w:r>
-        <w:rPr>
-          <w:b/>
-        </w:rPr>
         <w:t xml:space="preserve">Motor Constant</w:t>
       </w:r>
       <w:r>
@@ -5314,7 +5211,30 @@
         </w:numPr>
       </w:pPr>
       <w:r>
-        <w:t xml:space="preserve">It is the ability to produce Toqrue for a given input power. It is winding invariant. (i.e.,</w:t>
+        <w:t xml:space="preserve">It is the ability to produce Toqrue for a given input power. It is winding invariant</w:t>
+      </w:r>
+      <w:r>
+        <w:t xml:space="preserve"> </w:t>
+      </w:r>
+      <w:r>
+        <w:t xml:space="preserve">[</w:t>
+      </w:r>
+      <w:hyperlink w:anchor="ref-kenneally_leg_2015">
+        <w:r>
+          <w:rPr>
+            <w:rStyle w:val="Hyperlink"/>
+          </w:rPr>
+          <w:t xml:space="preserve">8</w:t>
+        </w:r>
+      </w:hyperlink>
+      <w:r>
+        <w:t xml:space="preserve">]</w:t>
+      </w:r>
+      <w:r>
+        <w:t xml:space="preserve"> </w:t>
+      </w:r>
+      <w:r>
+        <w:t xml:space="preserve">as long as same conductimg wires are used. (i.e.,</w:t>
       </w:r>
       <w:r>
         <w:t xml:space="preserve"> </w:t>
@@ -5904,31 +5824,16 @@
           <w:ilvl w:val="0"/>
         </w:numPr>
       </w:pPr>
-      <w:r>
-        <w:t xml:space="preserve">It is winding invariant</w:t>
-      </w:r>
-      <w:r>
-        <w:t xml:space="preserve"> </w:t>
-      </w:r>
-      <w:r>
-        <w:t xml:space="preserve">[</w:t>
-      </w:r>
-      <w:hyperlink w:anchor="ref-kenneally_leg_2015">
-        <w:r>
-          <w:rPr>
-            <w:rStyle w:val="Hyperlink"/>
-          </w:rPr>
-          <w:t xml:space="preserve">8</w:t>
-        </w:r>
-      </w:hyperlink>
-      <w:r>
-        <w:t xml:space="preserve">]</w:t>
-      </w:r>
-      <w:r>
-        <w:t xml:space="preserve"> </w:t>
-      </w:r>
-      <w:r>
-        <w:t xml:space="preserve">as long as same conductimg wires are used. For given winding volume,</w:t>
+    </w:p>
+    <w:p>
+      <w:pPr>
+        <w:numPr>
+          <w:numId w:val="1000"/>
+          <w:ilvl w:val="0"/>
+        </w:numPr>
+      </w:pPr>
+      <w:r>
+        <w:t xml:space="preserve">For given winding volume,</w:t>
       </w:r>
       <w:r>
         <w:t xml:space="preserve"> </w:t>
@@ -6143,16 +6048,8 @@
           </m:den>
         </m:f>
       </m:oMath>
-    </w:p>
-    <w:p>
-      <w:pPr>
-        <w:numPr>
-          <w:numId w:val="1000"/>
-          <w:ilvl w:val="0"/>
-        </w:numPr>
-      </w:pPr>
-      <w:r>
-        <w:t xml:space="preserve">The Torque constant</w:t>
+      <w:r>
+        <w:t xml:space="preserve">. The Torque constant</w:t>
       </w:r>
       <w:r>
         <w:t xml:space="preserve"> </w:t>
@@ -6175,7 +6072,7 @@
         <w:t xml:space="preserve"> </w:t>
       </w:r>
       <w:r>
-        <w:t xml:space="preserve">depends linearly on the number of turns around the core,</w:t>
+        <w:t xml:space="preserve">depends linearly on the number of turns around the core, thus:</w:t>
       </w:r>
     </w:p>
     <w:p>
@@ -6251,8 +6148,12 @@
     </w:p>
     <w:p>
       <w:pPr>
-        <w:pStyle w:val="FirstParagraph"/>
-      </w:pPr>
+        <w:numPr>
+          <w:numId w:val="1000"/>
+          <w:ilvl w:val="0"/>
+        </w:numPr>
+      </w:pPr>
+      <w:bookmarkStart w:id="37" w:name="eq:a"/>
       <m:oMathPara>
         <m:oMathParaPr>
           <m:jc m:val="center"/>
@@ -6326,13 +6227,30 @@
               </m:sSubSup>
             </m:den>
           </m:f>
+          <m:r>
+            <m:t>  </m:t>
+          </m:r>
+          <m:r>
+            <m:t>(</m:t>
+          </m:r>
+          <m:r>
+            <m:t>4</m:t>
+          </m:r>
+          <m:r>
+            <m:t>)</m:t>
+          </m:r>
         </m:oMath>
       </m:oMathPara>
-    </w:p>
-    <w:p>
-      <w:pPr>
-        <w:pStyle w:val="FirstParagraph"/>
-      </w:pPr>
+      <w:bookmarkEnd w:id="37"/>
+    </w:p>
+    <w:p>
+      <w:pPr>
+        <w:numPr>
+          <w:numId w:val="1000"/>
+          <w:ilvl w:val="0"/>
+        </w:numPr>
+      </w:pPr>
+      <w:bookmarkStart w:id="38" w:name="eq:b"/>
       <m:oMathPara>
         <m:oMathParaPr>
           <m:jc m:val="center"/>
@@ -6409,8 +6327,21 @@
               </m:sSubSup>
             </m:den>
           </m:f>
+          <m:r>
+            <m:t>  </m:t>
+          </m:r>
+          <m:r>
+            <m:t>(</m:t>
+          </m:r>
+          <m:r>
+            <m:t>5</m:t>
+          </m:r>
+          <m:r>
+            <m:t>)</m:t>
+          </m:r>
         </m:oMath>
       </m:oMathPara>
+      <w:bookmarkEnd w:id="38"/>
     </w:p>
     <w:p>
       <w:pPr>
@@ -6420,7 +6351,7 @@
         </w:numPr>
       </w:pPr>
       <w:r>
-        <w:t xml:space="preserve">thus</w:t>
+        <w:t xml:space="preserve">From eq. 4 and eq. 5</w:t>
       </w:r>
       <w:r>
         <w:t xml:space="preserve"> </w:t>
@@ -6430,6 +6361,9 @@
           <m:jc m:val="center"/>
         </m:oMathParaPr>
         <m:oMath>
+          <m:r>
+            <m:t>⟹</m:t>
+          </m:r>
           <m:sSub>
             <m:e>
               <m:r>
@@ -6502,7 +6436,15 @@
     </w:p>
     <w:p>
       <w:pPr>
-        <w:pStyle w:val="FirstParagraph"/>
+        <w:numPr>
+          <w:numId w:val="1000"/>
+          <w:ilvl w:val="0"/>
+        </w:numPr>
+      </w:pPr>
+    </w:p>
+    <w:p>
+      <w:pPr>
+        <w:pStyle w:val="BodyText"/>
       </w:pPr>
       <m:oMathPara>
         <m:oMathParaPr>
@@ -6833,6 +6775,9 @@
           <m:jc m:val="center"/>
         </m:oMathParaPr>
         <m:oMath>
+          <m:r>
+            <m:t>⟹</m:t>
+          </m:r>
           <m:sSubSup>
             <m:e>
               <m:r>
@@ -6895,9 +6840,6 @@
         </w:numPr>
       </w:pPr>
       <w:r>
-        <w:rPr>
-          <w:b/>
-        </w:rPr>
         <w:t xml:space="preserve">Electric Time Constant</w:t>
       </w:r>
     </w:p>
@@ -6976,9 +6918,6 @@
         </w:numPr>
       </w:pPr>
       <w:r>
-        <w:rPr>
-          <w:b/>
-        </w:rPr>
         <w:t xml:space="preserve">Mechanical Time Constant</w:t>
       </w:r>
     </w:p>
@@ -7270,15 +7209,9 @@
         </w:numPr>
       </w:pPr>
       <w:r>
-        <w:rPr>
-          <w:b/>
-        </w:rPr>
         <w:t xml:space="preserve">Thermal Specific Torque Density</w:t>
       </w:r>
       <w:r>
-        <w:rPr>
-          <w:b/>
-        </w:rPr>
         <w:t xml:space="preserve"> </w:t>
       </w:r>
       <m:oMath>
@@ -7307,7 +7240,30 @@
         </w:numPr>
       </w:pPr>
       <w:r>
-        <w:t xml:space="preserve">Form,</w:t>
+        <w:t xml:space="preserve">This measure describes a motor’s ability to produce torque at stall while the windings dissipate energy through Joule heating corresponding to</w:t>
+      </w:r>
+      <w:r>
+        <w:t xml:space="preserve"> </w:t>
+      </w:r>
+      <m:oMath>
+        <m:r>
+          <m:t>100</m:t>
+        </m:r>
+        <m:r>
+          <m:rPr>
+            <m:sty m:val="p"/>
+          </m:rPr>
+          <m:t>deg</m:t>
+        </m:r>
+        <m:r>
+          <m:t>C</m:t>
+        </m:r>
+      </m:oMath>
+      <w:r>
+        <w:t xml:space="preserve"> </w:t>
+      </w:r>
+      <w:r>
+        <w:t xml:space="preserve">rise</w:t>
       </w:r>
       <w:r>
         <w:t xml:space="preserve"> </w:t>
@@ -7327,7 +7283,7 @@
         <w:t xml:space="preserve">]</w:t>
       </w:r>
       <w:r>
-        <w:t xml:space="preserve">, we have</w:t>
+        <w:t xml:space="preserve">.</w:t>
       </w:r>
     </w:p>
     <w:p>
@@ -7431,13 +7387,161 @@
     </w:p>
     <w:p>
       <w:pPr>
+        <w:numPr>
+          <w:numId w:val="1000"/>
+          <w:ilvl w:val="0"/>
+        </w:numPr>
+      </w:pPr>
+      <w:r>
+        <w:t xml:space="preserve">where</w:t>
+      </w:r>
+      <w:r>
+        <w:t xml:space="preserve"> </w:t>
+      </w:r>
+      <m:oMath>
+        <m:sSub>
+          <m:e>
+            <m:r>
+              <m:t>K</m:t>
+            </m:r>
+          </m:e>
+          <m:sub>
+            <m:r>
+              <m:t>t</m:t>
+            </m:r>
+          </m:sub>
+        </m:sSub>
+      </m:oMath>
+      <w:r>
+        <w:t xml:space="preserve"> </w:t>
+      </w:r>
+      <w:r>
+        <w:t xml:space="preserve">is the torque constant (</w:t>
+      </w:r>
+      <m:oMath>
+        <m:f>
+          <m:fPr>
+            <m:type m:val="bar"/>
+          </m:fPr>
+          <m:num>
+            <m:r>
+              <m:t>N</m:t>
+            </m:r>
+            <m:r>
+              <m:t>m</m:t>
+            </m:r>
+          </m:num>
+          <m:den>
+            <m:r>
+              <m:t>A</m:t>
+            </m:r>
+          </m:den>
+        </m:f>
+      </m:oMath>
+      <w:r>
+        <w:t xml:space="preserve">),</w:t>
+      </w:r>
+      <w:r>
+        <w:t xml:space="preserve"> </w:t>
+      </w:r>
+      <m:oMath>
+        <m:r>
+          <m:t>m</m:t>
+        </m:r>
+      </m:oMath>
+      <w:r>
+        <w:t xml:space="preserve"> </w:t>
+      </w:r>
+      <w:r>
+        <w:t xml:space="preserve">is the motor mass (</w:t>
+      </w:r>
+      <m:oMath>
+        <m:r>
+          <m:t>k</m:t>
+        </m:r>
+        <m:r>
+          <m:t>g</m:t>
+        </m:r>
+      </m:oMath>
+      <w:r>
+        <w:t xml:space="preserve">),</w:t>
+      </w:r>
+      <w:r>
+        <w:t xml:space="preserve"> </w:t>
+      </w:r>
+      <m:oMath>
+        <m:sSub>
+          <m:e>
+            <m:r>
+              <m:t>R</m:t>
+            </m:r>
+          </m:e>
+          <m:sub>
+            <m:r>
+              <m:t>t</m:t>
+            </m:r>
+            <m:r>
+              <m:t>h</m:t>
+            </m:r>
+          </m:sub>
+        </m:sSub>
+      </m:oMath>
+      <w:r>
+        <w:t xml:space="preserve"> </w:t>
+      </w:r>
+      <w:r>
+        <w:t xml:space="preserve">is the motor thermal resistance (</w:t>
+      </w:r>
+      <m:oMath>
+        <m:f>
+          <m:fPr>
+            <m:type m:val="bar"/>
+          </m:fPr>
+          <m:num>
+            <m:r>
+              <m:rPr>
+                <m:sty m:val="p"/>
+              </m:rPr>
+              <m:t>deg</m:t>
+            </m:r>
+            <m:r>
+              <m:t>C</m:t>
+            </m:r>
+          </m:num>
+          <m:den>
+            <m:r>
+              <m:t>W</m:t>
+            </m:r>
+          </m:den>
+        </m:f>
+      </m:oMath>
+      <w:r>
+        <w:t xml:space="preserve">) and</w:t>
+      </w:r>
+      <w:r>
+        <w:t xml:space="preserve"> </w:t>
+      </w:r>
+      <m:oMath>
+        <m:r>
+          <m:t>R</m:t>
+        </m:r>
+      </m:oMath>
+      <w:r>
+        <w:t xml:space="preserve"> </w:t>
+      </w:r>
+      <w:r>
+        <w:t xml:space="preserve">is the winding electrical resistance in ohm.</w:t>
+      </w:r>
+    </w:p>
+    <w:p>
+      <w:pPr>
         <w:pStyle w:val="Heading5"/>
       </w:pPr>
-      <w:bookmarkStart w:id="37" w:name="loading"/>
+      <w:bookmarkStart w:id="39" w:name="loading"/>
       <w:r>
         <w:t xml:space="preserve">Loading</w:t>
       </w:r>
-      <w:bookmarkEnd w:id="37"/>
+      <w:bookmarkEnd w:id="39"/>
     </w:p>
     <w:p>
       <w:pPr>
@@ -7447,15 +7551,9 @@
         </w:numPr>
       </w:pPr>
       <w:r>
-        <w:rPr>
-          <w:b/>
-        </w:rPr>
         <w:t xml:space="preserve">Specific Electrical Loading</w:t>
       </w:r>
       <w:r>
-        <w:rPr>
-          <w:b/>
-        </w:rPr>
         <w:t xml:space="preserve"> </w:t>
       </w:r>
       <m:oMath>
@@ -7485,33 +7583,7 @@
         </w:numPr>
       </w:pPr>
       <w:r>
-        <w:t xml:space="preserve">Avergae</w:t>
-      </w:r>
-      <w:r>
-        <w:t xml:space="preserve"> </w:t>
-      </w:r>
-      <w:r>
-        <w:rPr>
-          <w:b/>
-        </w:rPr>
-        <w:t xml:space="preserve">Axial</w:t>
-      </w:r>
-      <w:r>
-        <w:t xml:space="preserve"> </w:t>
-      </w:r>
-      <w:r>
-        <w:t xml:space="preserve">current per meter of circumference on the rotor.</w:t>
-      </w:r>
-    </w:p>
-    <w:p>
-      <w:pPr>
-        <w:numPr>
-          <w:numId w:val="1000"/>
-          <w:ilvl w:val="0"/>
-        </w:numPr>
-      </w:pPr>
-      <w:r>
-        <w:t xml:space="preserve">[Design of Brushless Permanent-Magnet Machines, p. 68]</w:t>
+        <w:t xml:space="preserve">Avergae axial current per meter of circumference on the rotor. The current is concentarted in the conductors between the slot.</w:t>
       </w:r>
     </w:p>
     <w:p>
@@ -7522,15 +7594,9 @@
         </w:numPr>
       </w:pPr>
       <w:r>
-        <w:rPr>
-          <w:b/>
-        </w:rPr>
         <w:t xml:space="preserve">Specific Magnetic Loading</w:t>
       </w:r>
       <w:r>
-        <w:rPr>
-          <w:b/>
-        </w:rPr>
         <w:t xml:space="preserve"> </w:t>
       </w:r>
       <m:oMath>
@@ -7560,23 +7626,16 @@
         </w:numPr>
       </w:pPr>
       <w:r>
-        <w:t xml:space="preserve">Average magnitude of</w:t>
-      </w:r>
-      <w:r>
-        <w:t xml:space="preserve"> </w:t>
-      </w:r>
-      <w:r>
-        <w:rPr>
-          <w:b/>
-        </w:rPr>
-        <w:t xml:space="preserve">radial flux</w:t>
-      </w:r>
-      <w:r>
-        <w:t xml:space="preserve"> </w:t>
-      </w:r>
-      <w:r>
-        <w:t xml:space="preserve">density over the entire cylindrical surface of the rotor.</w:t>
-      </w:r>
+        <w:t xml:space="preserve">Average radial flux density over the entire cylindrical surface of the rotor. density over the entire cylindrical surface of the rotor. Because of the slotting, the average flux density is always less than the flux density in the teeth.</w:t>
+      </w:r>
+    </w:p>
+    <w:p>
+      <w:pPr>
+        <w:numPr>
+          <w:numId w:val="1000"/>
+          <w:ilvl w:val="0"/>
+        </w:numPr>
+      </w:pPr>
     </w:p>
     <w:p>
       <w:pPr>
@@ -7648,7 +7707,7 @@
         </w:numPr>
       </w:pPr>
       <w:r>
-        <w:t xml:space="preserve">In case we widen our slots to accomodate more copper</w:t>
+        <w:t xml:space="preserve">In case we widen our slots to accomodate more copper/conductor</w:t>
       </w:r>
       <w:r>
         <w:t xml:space="preserve"> </w:t>
@@ -7702,7 +7761,7 @@
         <w:t xml:space="preserve"> </w:t>
       </w:r>
       <w:r>
-        <w:t xml:space="preserve">may reduce because narrower teeth means less area for flux, and therefore has danger of stauration of iron.</w:t>
+        <w:t xml:space="preserve">may reduce because narrower teeth means less area for flux, and therefore has danger of stauration of iron. Thus a compromise has to be made for a given a volume.</w:t>
       </w:r>
     </w:p>
     <w:p>
@@ -7712,9 +7771,6 @@
           <w:ilvl w:val="0"/>
         </w:numPr>
       </w:pPr>
-      <w:r>
-        <w:t xml:space="preserve">[Design of Brushless Permanent-Magnet Machines, p. 68]</w:t>
-      </w:r>
     </w:p>
     <w:p>
       <w:pPr>
@@ -7724,9 +7780,6 @@
         </w:numPr>
       </w:pPr>
       <w:r>
-        <w:rPr>
-          <w:b/>
-        </w:rPr>
         <w:t xml:space="preserve">Thermal Load (C)</w:t>
       </w:r>
     </w:p>
@@ -7753,11 +7806,11 @@
       <w:pPr>
         <w:pStyle w:val="Heading3"/>
       </w:pPr>
-      <w:bookmarkStart w:id="38" w:name="losses"/>
+      <w:bookmarkStart w:id="40" w:name="losses"/>
       <w:r>
         <w:t xml:space="preserve">Losses</w:t>
       </w:r>
-      <w:bookmarkEnd w:id="38"/>
+      <w:bookmarkEnd w:id="40"/>
     </w:p>
     <w:p>
       <w:pPr>
@@ -7949,11 +8002,11 @@
       <w:pPr>
         <w:pStyle w:val="Heading3"/>
       </w:pPr>
-      <w:bookmarkStart w:id="39" w:name="to-do"/>
+      <w:bookmarkStart w:id="41" w:name="to-do"/>
       <w:r>
         <w:t xml:space="preserve">To Do</w:t>
       </w:r>
-      <w:bookmarkEnd w:id="39"/>
+      <w:bookmarkEnd w:id="41"/>
     </w:p>
     <w:p>
       <w:pPr>
@@ -8000,14 +8053,14 @@
       <w:pPr>
         <w:pStyle w:val="Heading3"/>
       </w:pPr>
-      <w:bookmarkStart w:id="40" w:name="references"/>
+      <w:bookmarkStart w:id="42" w:name="references"/>
       <w:r>
         <w:t xml:space="preserve">References</w:t>
       </w:r>
-      <w:bookmarkEnd w:id="40"/>
-    </w:p>
-    <w:bookmarkStart w:id="55" w:name="refs"/>
-    <w:bookmarkStart w:id="42" w:name="ref-colton_design_2010"/>
+      <w:bookmarkEnd w:id="42"/>
+    </w:p>
+    <w:bookmarkStart w:id="57" w:name="refs"/>
+    <w:bookmarkStart w:id="44" w:name="ref-colton_design_2010"/>
     <w:p>
       <w:pPr>
         <w:pStyle w:val="Bibliography"/>
@@ -8018,7 +8071,7 @@
       <w:r>
         <w:t xml:space="preserve"> </w:t>
       </w:r>
-      <w:hyperlink r:id="rId41">
+      <w:hyperlink r:id="rId43">
         <w:r>
           <w:rPr>
             <w:rStyle w:val="Hyperlink"/>
@@ -8027,8 +8080,8 @@
         </w:r>
       </w:hyperlink>
     </w:p>
-    <w:bookmarkEnd w:id="42"/>
-    <w:bookmarkStart w:id="43" w:name="ref-hendershot_design_2010"/>
+    <w:bookmarkEnd w:id="44"/>
+    <w:bookmarkStart w:id="45" w:name="ref-hendershot_design_2010"/>
     <w:p>
       <w:pPr>
         <w:pStyle w:val="Bibliography"/>
@@ -8052,8 +8105,8 @@
         <w:t xml:space="preserve"> </w:t>
       </w:r>
     </w:p>
-    <w:bookmarkEnd w:id="43"/>
-    <w:bookmarkStart w:id="44" w:name="ref-kalouche_design_2016"/>
+    <w:bookmarkEnd w:id="45"/>
+    <w:bookmarkStart w:id="46" w:name="ref-kalouche_design_2016"/>
     <w:p>
       <w:pPr>
         <w:pStyle w:val="Bibliography"/>
@@ -8065,8 +8118,8 @@
         <w:t xml:space="preserve"> </w:t>
       </w:r>
     </w:p>
-    <w:bookmarkEnd w:id="44"/>
-    <w:bookmarkStart w:id="46" w:name="ref-seok_actuator_2012"/>
+    <w:bookmarkEnd w:id="46"/>
+    <w:bookmarkStart w:id="48" w:name="ref-seok_actuator_2012"/>
     <w:p>
       <w:pPr>
         <w:pStyle w:val="Bibliography"/>
@@ -8089,7 +8142,7 @@
       <w:r>
         <w:t xml:space="preserve"> </w:t>
       </w:r>
-      <w:hyperlink r:id="rId45">
+      <w:hyperlink r:id="rId47">
         <w:r>
           <w:rPr>
             <w:rStyle w:val="Hyperlink"/>
@@ -8101,8 +8154,8 @@
         <w:t xml:space="preserve">. [Accessed: 12-Sep-2018]</w:t>
       </w:r>
     </w:p>
-    <w:bookmarkEnd w:id="46"/>
-    <w:bookmarkStart w:id="47" w:name="ref-wensing_proprioceptive_2017"/>
+    <w:bookmarkEnd w:id="48"/>
+    <w:bookmarkStart w:id="49" w:name="ref-wensing_proprioceptive_2017"/>
     <w:p>
       <w:pPr>
         <w:pStyle w:val="Bibliography"/>
@@ -8126,8 +8179,8 @@
         <w:t xml:space="preserve"> </w:t>
       </w:r>
     </w:p>
-    <w:bookmarkEnd w:id="47"/>
-    <w:bookmarkStart w:id="48" w:name="ref-mason_compliance_1981"/>
+    <w:bookmarkEnd w:id="49"/>
+    <w:bookmarkStart w:id="50" w:name="ref-mason_compliance_1981"/>
     <w:p>
       <w:pPr>
         <w:pStyle w:val="Bibliography"/>
@@ -8151,8 +8204,8 @@
         <w:t xml:space="preserve"> </w:t>
       </w:r>
     </w:p>
-    <w:bookmarkEnd w:id="48"/>
-    <w:bookmarkStart w:id="49" w:name="ref-hughes_electric_2013"/>
+    <w:bookmarkEnd w:id="50"/>
+    <w:bookmarkStart w:id="51" w:name="ref-hughes_electric_2013"/>
     <w:p>
       <w:pPr>
         <w:pStyle w:val="Bibliography"/>
@@ -8176,8 +8229,8 @@
         <w:t xml:space="preserve"> </w:t>
       </w:r>
     </w:p>
-    <w:bookmarkEnd w:id="49"/>
-    <w:bookmarkStart w:id="51" w:name="ref-kenneally_leg_2015"/>
+    <w:bookmarkEnd w:id="51"/>
+    <w:bookmarkStart w:id="53" w:name="ref-kenneally_leg_2015"/>
     <w:p>
       <w:pPr>
         <w:pStyle w:val="Bibliography"/>
@@ -8200,7 +8253,7 @@
       <w:r>
         <w:t xml:space="preserve"> </w:t>
       </w:r>
-      <w:hyperlink r:id="rId50">
+      <w:hyperlink r:id="rId52">
         <w:r>
           <w:rPr>
             <w:rStyle w:val="Hyperlink"/>
@@ -8212,8 +8265,8 @@
         <w:t xml:space="preserve">. [Accessed: 27-Sep-2018]</w:t>
       </w:r>
     </w:p>
-    <w:bookmarkEnd w:id="51"/>
-    <w:bookmarkStart w:id="52" w:name="ref-asada_direct-drive_1987"/>
+    <w:bookmarkEnd w:id="53"/>
+    <w:bookmarkStart w:id="54" w:name="ref-asada_direct-drive_1987"/>
     <w:p>
       <w:pPr>
         <w:pStyle w:val="Bibliography"/>
@@ -8237,8 +8290,8 @@
         <w:t xml:space="preserve"> </w:t>
       </w:r>
     </w:p>
-    <w:bookmarkEnd w:id="52"/>
-    <w:bookmarkStart w:id="54" w:name="ref-kenneally_design_2016"/>
+    <w:bookmarkEnd w:id="54"/>
+    <w:bookmarkStart w:id="56" w:name="ref-kenneally_design_2016"/>
     <w:p>
       <w:pPr>
         <w:pStyle w:val="Bibliography"/>
@@ -8261,7 +8314,7 @@
       <w:r>
         <w:t xml:space="preserve"> </w:t>
       </w:r>
-      <w:hyperlink r:id="rId53">
+      <w:hyperlink r:id="rId55">
         <w:r>
           <w:rPr>
             <w:rStyle w:val="Hyperlink"/>
@@ -8273,8 +8326,8 @@
         <w:t xml:space="preserve">. [Accessed: 12-Sep-2018]</w:t>
       </w:r>
     </w:p>
-    <w:bookmarkEnd w:id="54"/>
-    <w:bookmarkEnd w:id="55"/>
+    <w:bookmarkEnd w:id="56"/>
+    <w:bookmarkEnd w:id="57"/>
     <w:sectPr/>
   </w:body>
 </w:document>

</xml_diff>

<commit_message>
rough template for actuators for robotics
</commit_message>
<xml_diff>
--- a/_includes/blog/notes/motor/output/motor.docx
+++ b/_includes/blog/notes/motor/output/motor.docx
@@ -1816,6 +1816,14 @@
     </w:p>
     <w:p>
       <w:pPr>
+        <w:numPr>
+          <w:numId w:val="1000"/>
+          <w:ilvl w:val="0"/>
+        </w:numPr>
+      </w:pPr>
+    </w:p>
+    <w:p>
+      <w:pPr>
         <w:pStyle w:val="BodyText"/>
       </w:pPr>
       <m:oMathPara>
@@ -3609,6 +3617,14 @@
         </w:rPr>
         <w:t xml:space="preserve">Derivation:</w:t>
       </w:r>
+    </w:p>
+    <w:p>
+      <w:pPr>
+        <w:numPr>
+          <w:numId w:val="1000"/>
+          <w:ilvl w:val="0"/>
+        </w:numPr>
+      </w:pPr>
     </w:p>
     <w:p>
       <w:pPr>
@@ -5425,12 +5441,28 @@
           <w:ilvl w:val="0"/>
         </w:numPr>
       </w:pPr>
+    </w:p>
+    <w:p>
+      <w:pPr>
+        <w:numPr>
+          <w:numId w:val="1000"/>
+          <w:ilvl w:val="0"/>
+        </w:numPr>
+      </w:pPr>
       <w:r>
         <w:rPr>
           <w:i/>
         </w:rPr>
         <w:t xml:space="preserve">Derivation:</w:t>
       </w:r>
+    </w:p>
+    <w:p>
+      <w:pPr>
+        <w:numPr>
+          <w:numId w:val="1000"/>
+          <w:ilvl w:val="0"/>
+        </w:numPr>
+      </w:pPr>
     </w:p>
     <w:p>
       <w:pPr>
@@ -7817,12 +7849,11 @@
         <w:pStyle w:val="FirstParagraph"/>
       </w:pPr>
       <w:r>
-        <w:t xml:space="preserve">Inefficiencies can be grouped into two general categories:</w:t>
-      </w:r>
-    </w:p>
-    <w:p>
-      <w:pPr>
-        <w:pStyle w:val="Compact"/>
+        <w:t xml:space="preserve">Losses can be majorly grouped into two general categories:</w:t>
+      </w:r>
+    </w:p>
+    <w:p>
+      <w:pPr>
         <w:numPr>
           <w:numId w:val="1009"/>
           <w:ilvl w:val="0"/>
@@ -7854,7 +7885,17 @@
     </w:p>
     <w:p>
       <w:pPr>
-        <w:pStyle w:val="Compact"/>
+        <w:numPr>
+          <w:numId w:val="1000"/>
+          <w:ilvl w:val="0"/>
+        </w:numPr>
+      </w:pPr>
+      <w:r>
+        <w:t xml:space="preserve">They are due to resistance heating of the windings, and are proportional to the square of the output torque.</w:t>
+      </w:r>
+    </w:p>
+    <w:p>
+      <w:pPr>
         <w:numPr>
           <w:numId w:val="1009"/>
           <w:ilvl w:val="0"/>
@@ -7886,115 +7927,31 @@
     </w:p>
     <w:p>
       <w:pPr>
+        <w:numPr>
+          <w:numId w:val="1000"/>
+          <w:ilvl w:val="0"/>
+        </w:numPr>
+      </w:pPr>
+      <w:r>
+        <w:t xml:space="preserve">Iron Core Losses = Eddy Curremt Losses + Hystersis Losses</w:t>
+      </w:r>
+    </w:p>
+    <w:p>
+      <w:pPr>
+        <w:numPr>
+          <w:numId w:val="1000"/>
+          <w:ilvl w:val="0"/>
+        </w:numPr>
+      </w:pPr>
+      <w:r>
+        <w:t xml:space="preserve">Hysteresis in the magnetic domains in the core appears as a constant friction torque, while the eddy current torque is proportional to speed.</w:t>
+      </w:r>
+    </w:p>
+    <w:p>
+      <w:pPr>
         <w:pStyle w:val="FirstParagraph"/>
       </w:pPr>
       <w:r>
-        <w:rPr>
-          <w:b/>
-        </w:rPr>
-        <w:t xml:space="preserve">Torque/Copper/</w:t>
-      </w:r>
-      <m:oMath>
-        <m:sSup>
-          <m:e>
-            <m:r>
-              <m:t>I</m:t>
-            </m:r>
-          </m:e>
-          <m:sup>
-            <m:r>
-              <m:t>2</m:t>
-            </m:r>
-          </m:sup>
-        </m:sSup>
-      </m:oMath>
-      <w:r>
-        <w:rPr>
-          <w:b/>
-        </w:rPr>
-        <w:t xml:space="preserve"> </w:t>
-      </w:r>
-      <w:r>
-        <w:rPr>
-          <w:b/>
-        </w:rPr>
-        <w:t xml:space="preserve">Losses: Winding Resistance, Power Ratings</w:t>
-      </w:r>
-    </w:p>
-    <w:p>
-      <w:pPr>
-        <w:pStyle w:val="BodyText"/>
-      </w:pPr>
-      <w:r>
-        <w:t xml:space="preserve">They are due to resistance heating of the windings, and are proportional to the square of the output torque.</w:t>
-      </w:r>
-    </w:p>
-    <w:p>
-      <w:pPr>
-        <w:pStyle w:val="BodyText"/>
-      </w:pPr>
-      <w:r>
-        <w:rPr>
-          <w:b/>
-        </w:rPr>
-        <w:t xml:space="preserve">Speed/Iron/</w:t>
-      </w:r>
-      <m:oMath>
-        <m:sSup>
-          <m:e>
-            <m:r>
-              <m:t>E</m:t>
-            </m:r>
-          </m:e>
-          <m:sup>
-            <m:r>
-              <m:t>2</m:t>
-            </m:r>
-          </m:sup>
-        </m:sSup>
-      </m:oMath>
-      <w:r>
-        <w:rPr>
-          <w:b/>
-        </w:rPr>
-        <w:t xml:space="preserve"> </w:t>
-      </w:r>
-      <w:r>
-        <w:rPr>
-          <w:b/>
-        </w:rPr>
-        <w:t xml:space="preserve">Losses: Delta Windings, Eddy Current, and Mechanical Losses</w:t>
-      </w:r>
-    </w:p>
-    <w:p>
-      <w:pPr>
-        <w:pStyle w:val="BodyText"/>
-      </w:pPr>
-      <w:r>
-        <w:t xml:space="preserve">Iron Core Losses = Eddy Curremt Losses + Hystersis Losses</w:t>
-      </w:r>
-    </w:p>
-    <w:p>
-      <w:pPr>
-        <w:pStyle w:val="BodyText"/>
-      </w:pPr>
-      <w:r>
-        <w:t xml:space="preserve">Hysteresis in the magnetic domains in the core appears as a constant friction torque, while the eddy current torque is proportional to speed.</w:t>
-      </w:r>
-    </w:p>
-    <w:p>
-      <w:pPr>
-        <w:pStyle w:val="BodyText"/>
-      </w:pPr>
-      <w:r>
-        <w:t xml:space="preserve"> </w:t>
-      </w:r>
-    </w:p>
-    <w:p>
-      <w:pPr>
-        <w:pStyle w:val="BodyText"/>
-      </w:pPr>
-      <w:r>
         <w:t xml:space="preserve"> </w:t>
       </w:r>
     </w:p>
@@ -8002,65 +7959,19 @@
       <w:pPr>
         <w:pStyle w:val="Heading3"/>
       </w:pPr>
-      <w:bookmarkStart w:id="41" w:name="to-do"/>
-      <w:r>
-        <w:t xml:space="preserve">To Do</w:t>
+      <w:bookmarkStart w:id="41" w:name="references"/>
+      <w:r>
+        <w:t xml:space="preserve">References</w:t>
       </w:r>
       <w:bookmarkEnd w:id="41"/>
     </w:p>
     <w:p>
       <w:pPr>
-        <w:pStyle w:val="Compact"/>
-        <w:numPr>
-          <w:numId w:val="1010"/>
-          <w:ilvl w:val="0"/>
-        </w:numPr>
-      </w:pPr>
-      <w:r>
-        <w:t xml:space="preserve">Focus on charcteristic section</w:t>
-      </w:r>
-    </w:p>
-    <w:p>
-      <w:pPr>
-        <w:pStyle w:val="Compact"/>
-        <w:numPr>
-          <w:numId w:val="1010"/>
-          <w:ilvl w:val="0"/>
-        </w:numPr>
-      </w:pPr>
-      <w:r>
-        <w:t xml:space="preserve">Finish the core vs corless section</w:t>
-      </w:r>
-    </w:p>
-    <w:p>
-      <w:pPr>
-        <w:pStyle w:val="Compact"/>
-        <w:numPr>
-          <w:numId w:val="1010"/>
-          <w:ilvl w:val="0"/>
-        </w:numPr>
-      </w:pPr>
-      <w:r>
-        <w:t xml:space="preserve">BLDC and chaos</w:t>
-      </w:r>
-    </w:p>
-    <w:p>
-      <w:pPr>
         <w:pStyle w:val="FirstParagraph"/>
       </w:pPr>
     </w:p>
-    <w:p>
-      <w:pPr>
-        <w:pStyle w:val="Heading3"/>
-      </w:pPr>
-      <w:bookmarkStart w:id="42" w:name="references"/>
-      <w:r>
-        <w:t xml:space="preserve">References</w:t>
-      </w:r>
-      <w:bookmarkEnd w:id="42"/>
-    </w:p>
-    <w:bookmarkStart w:id="57" w:name="refs"/>
-    <w:bookmarkStart w:id="44" w:name="ref-colton_design_2010"/>
+    <w:bookmarkStart w:id="56" w:name="refs"/>
+    <w:bookmarkStart w:id="43" w:name="ref-colton_design_2010"/>
     <w:p>
       <w:pPr>
         <w:pStyle w:val="Bibliography"/>
@@ -8071,7 +7982,7 @@
       <w:r>
         <w:t xml:space="preserve"> </w:t>
       </w:r>
-      <w:hyperlink r:id="rId43">
+      <w:hyperlink r:id="rId42">
         <w:r>
           <w:rPr>
             <w:rStyle w:val="Hyperlink"/>
@@ -8080,8 +7991,8 @@
         </w:r>
       </w:hyperlink>
     </w:p>
-    <w:bookmarkEnd w:id="44"/>
-    <w:bookmarkStart w:id="45" w:name="ref-hendershot_design_2010"/>
+    <w:bookmarkEnd w:id="43"/>
+    <w:bookmarkStart w:id="44" w:name="ref-hendershot_design_2010"/>
     <w:p>
       <w:pPr>
         <w:pStyle w:val="Bibliography"/>
@@ -8105,21 +8016,21 @@
         <w:t xml:space="preserve"> </w:t>
       </w:r>
     </w:p>
+    <w:bookmarkEnd w:id="44"/>
+    <w:bookmarkStart w:id="45" w:name="ref-kalouche_design_2016"/>
+    <w:p>
+      <w:pPr>
+        <w:pStyle w:val="Bibliography"/>
+      </w:pPr>
+      <w:r>
+        <w:t xml:space="preserve">[3] S. Kalouche, “Design for 3d Agility and Virtual Compliance Using Proprioceptive Force Control in Dynamic Legged Robots,” PhD thesis, Carnegie Mellon University, 2016.</w:t>
+      </w:r>
+      <w:r>
+        <w:t xml:space="preserve"> </w:t>
+      </w:r>
+    </w:p>
     <w:bookmarkEnd w:id="45"/>
-    <w:bookmarkStart w:id="46" w:name="ref-kalouche_design_2016"/>
-    <w:p>
-      <w:pPr>
-        <w:pStyle w:val="Bibliography"/>
-      </w:pPr>
-      <w:r>
-        <w:t xml:space="preserve">[3] S. Kalouche, “Design for 3d Agility and Virtual Compliance Using Proprioceptive Force Control in Dynamic Legged Robots,” PhD thesis, Carnegie Mellon University, 2016.</w:t>
-      </w:r>
-      <w:r>
-        <w:t xml:space="preserve"> </w:t>
-      </w:r>
-    </w:p>
-    <w:bookmarkEnd w:id="46"/>
-    <w:bookmarkStart w:id="48" w:name="ref-seok_actuator_2012"/>
+    <w:bookmarkStart w:id="47" w:name="ref-seok_actuator_2012"/>
     <w:p>
       <w:pPr>
         <w:pStyle w:val="Bibliography"/>
@@ -8142,7 +8053,7 @@
       <w:r>
         <w:t xml:space="preserve"> </w:t>
       </w:r>
-      <w:hyperlink r:id="rId47">
+      <w:hyperlink r:id="rId46">
         <w:r>
           <w:rPr>
             <w:rStyle w:val="Hyperlink"/>
@@ -8154,8 +8065,8 @@
         <w:t xml:space="preserve">. [Accessed: 12-Sep-2018]</w:t>
       </w:r>
     </w:p>
-    <w:bookmarkEnd w:id="48"/>
-    <w:bookmarkStart w:id="49" w:name="ref-wensing_proprioceptive_2017"/>
+    <w:bookmarkEnd w:id="47"/>
+    <w:bookmarkStart w:id="48" w:name="ref-wensing_proprioceptive_2017"/>
     <w:p>
       <w:pPr>
         <w:pStyle w:val="Bibliography"/>
@@ -8179,8 +8090,8 @@
         <w:t xml:space="preserve"> </w:t>
       </w:r>
     </w:p>
-    <w:bookmarkEnd w:id="49"/>
-    <w:bookmarkStart w:id="50" w:name="ref-mason_compliance_1981"/>
+    <w:bookmarkEnd w:id="48"/>
+    <w:bookmarkStart w:id="49" w:name="ref-mason_compliance_1981"/>
     <w:p>
       <w:pPr>
         <w:pStyle w:val="Bibliography"/>
@@ -8204,8 +8115,8 @@
         <w:t xml:space="preserve"> </w:t>
       </w:r>
     </w:p>
-    <w:bookmarkEnd w:id="50"/>
-    <w:bookmarkStart w:id="51" w:name="ref-hughes_electric_2013"/>
+    <w:bookmarkEnd w:id="49"/>
+    <w:bookmarkStart w:id="50" w:name="ref-hughes_electric_2013"/>
     <w:p>
       <w:pPr>
         <w:pStyle w:val="Bibliography"/>
@@ -8229,8 +8140,8 @@
         <w:t xml:space="preserve"> </w:t>
       </w:r>
     </w:p>
-    <w:bookmarkEnd w:id="51"/>
-    <w:bookmarkStart w:id="53" w:name="ref-kenneally_leg_2015"/>
+    <w:bookmarkEnd w:id="50"/>
+    <w:bookmarkStart w:id="52" w:name="ref-kenneally_leg_2015"/>
     <w:p>
       <w:pPr>
         <w:pStyle w:val="Bibliography"/>
@@ -8253,7 +8164,7 @@
       <w:r>
         <w:t xml:space="preserve"> </w:t>
       </w:r>
-      <w:hyperlink r:id="rId52">
+      <w:hyperlink r:id="rId51">
         <w:r>
           <w:rPr>
             <w:rStyle w:val="Hyperlink"/>
@@ -8265,8 +8176,8 @@
         <w:t xml:space="preserve">. [Accessed: 27-Sep-2018]</w:t>
       </w:r>
     </w:p>
-    <w:bookmarkEnd w:id="53"/>
-    <w:bookmarkStart w:id="54" w:name="ref-asada_direct-drive_1987"/>
+    <w:bookmarkEnd w:id="52"/>
+    <w:bookmarkStart w:id="53" w:name="ref-asada_direct-drive_1987"/>
     <w:p>
       <w:pPr>
         <w:pStyle w:val="Bibliography"/>
@@ -8290,8 +8201,8 @@
         <w:t xml:space="preserve"> </w:t>
       </w:r>
     </w:p>
-    <w:bookmarkEnd w:id="54"/>
-    <w:bookmarkStart w:id="56" w:name="ref-kenneally_design_2016"/>
+    <w:bookmarkEnd w:id="53"/>
+    <w:bookmarkStart w:id="55" w:name="ref-kenneally_design_2016"/>
     <w:p>
       <w:pPr>
         <w:pStyle w:val="Bibliography"/>
@@ -8314,7 +8225,7 @@
       <w:r>
         <w:t xml:space="preserve"> </w:t>
       </w:r>
-      <w:hyperlink r:id="rId55">
+      <w:hyperlink r:id="rId54">
         <w:r>
           <w:rPr>
             <w:rStyle w:val="Hyperlink"/>
@@ -8326,8 +8237,8 @@
         <w:t xml:space="preserve">. [Accessed: 12-Sep-2018]</w:t>
       </w:r>
     </w:p>
+    <w:bookmarkEnd w:id="55"/>
     <w:bookmarkEnd w:id="56"/>
-    <w:bookmarkEnd w:id="57"/>
     <w:sectPr/>
   </w:body>
 </w:document>
@@ -9057,36 +8968,6 @@
     </w:lvlOverride>
   </w:num>
   <w:num w:numId="1009">
-    <w:abstractNumId w:val="99411"/>
-    <w:lvlOverride w:ilvl="0">
-      <w:startOverride w:val="1"/>
-    </w:lvlOverride>
-    <w:lvlOverride w:ilvl="1">
-      <w:startOverride w:val="1"/>
-    </w:lvlOverride>
-    <w:lvlOverride w:ilvl="2">
-      <w:startOverride w:val="1"/>
-    </w:lvlOverride>
-    <w:lvlOverride w:ilvl="3">
-      <w:startOverride w:val="1"/>
-    </w:lvlOverride>
-    <w:lvlOverride w:ilvl="4">
-      <w:startOverride w:val="1"/>
-    </w:lvlOverride>
-    <w:lvlOverride w:ilvl="5">
-      <w:startOverride w:val="1"/>
-    </w:lvlOverride>
-    <w:lvlOverride w:ilvl="6">
-      <w:startOverride w:val="1"/>
-    </w:lvlOverride>
-    <w:lvlOverride w:ilvl="7">
-      <w:startOverride w:val="1"/>
-    </w:lvlOverride>
-    <w:lvlOverride w:ilvl="8">
-      <w:startOverride w:val="1"/>
-    </w:lvlOverride>
-  </w:num>
-  <w:num w:numId="1010">
     <w:abstractNumId w:val="99411"/>
     <w:lvlOverride w:ilvl="0">
       <w:startOverride w:val="1"/>

</xml_diff>